<commit_message>
Break down travel budget into per-item line items that sum to $30,000
Field trips (Yrs 1-3 Montpelier, Yr 4 joint conference): $4,500/trip × 4.
Conference (1 traveler): $3,000/trip × 4. Total $7,500/year.

Claude-Session: https://claude.ai/code/session_01NJ9GtX733WDReMAVymNuZy
</commit_message>
<xml_diff>
--- a/NSF Budget_Justification.docx
+++ b/NSF Budget_Justification.docx
@@ -1141,95 +1141,21 @@
       </w:pPr>
       <w:r>
         <w:rPr>
-          <w:rFonts w:ascii="Times New Roman" w:hAnsi="Times New Roman" w:cs="Times New Roman"/>
-          <w:b/>
-          <w:bCs/>
-          <w:u w:val="single"/>
-        </w:rPr>
-        <w:t>Domestic Travel</w:t>
-      </w:r>
-      <w:r>
-        <w:rPr>
-          <w:rFonts w:ascii="Times New Roman" w:hAnsi="Times New Roman" w:cs="Times New Roman"/>
-          <w:b/>
-          <w:bCs/>
-          <w:u w:val="single"/>
-        </w:rPr>
-        <w:t xml:space="preserve"> ($</w:t>
-      </w:r>
-      <w:r>
-        <w:rPr>
-          <w:rFonts w:ascii="Times New Roman" w:hAnsi="Times New Roman" w:cs="Times New Roman"/>
-          <w:b/>
-          <w:bCs/>
-          <w:u w:val="single"/>
-        </w:rPr>
-        <w:t>30,000</w:t>
-      </w:r>
-      <w:r>
-        <w:rPr>
-          <w:rFonts w:ascii="Times New Roman" w:hAnsi="Times New Roman" w:cs="Times New Roman"/>
-          <w:b/>
-          <w:bCs/>
-          <w:u w:val="single"/>
-        </w:rPr>
-        <w:t>)</w:t>
-      </w:r>
-      <w:r>
-        <w:rPr>
-          <w:rFonts w:ascii="Times New Roman" w:hAnsi="Times New Roman" w:cs="Times New Roman"/>
-          <w:b/>
-          <w:bCs/>
-        </w:rPr>
-        <w:t xml:space="preserve"> </w:t>
-      </w:r>
-      <w:r>
-        <w:rPr>
-          <w:rFonts w:ascii="Times New Roman" w:eastAsiaTheme="minorEastAsia" w:hAnsi="Times New Roman" w:cs="Times New Roman"/>
-        </w:rPr>
-        <w:t>–</w:t>
-      </w:r>
-      <w:r>
-        <w:rPr>
-          <w:rFonts w:ascii="Times New Roman" w:hAnsi="Times New Roman" w:cs="Times New Roman"/>
-          <w:b/>
-          <w:bCs/>
-        </w:rPr>
-        <w:t xml:space="preserve"> </w:t>
-      </w:r>
-      <w:r>
-        <w:rPr>
-          <w:rFonts w:ascii="Times New Roman" w:hAnsi="Times New Roman" w:cs="Times New Roman"/>
-          <w:bCs/>
-          <w:color w:val="FF0000"/>
-        </w:rPr>
-        <w:t>$7,500 per year for four years. Travel supports (1) annual field trips to Montpelier, Vermont for community co-development workshops with emergency managers, historic preservation officials, and building owners (Years 1–3), including one in-person workshop per year (estimated $3,000/trip: airfare, lodging, ground transportation, and per diem for PI and postdoctoral researcher); and (2) attendance at one national conference per year (estimated $2,500/trip) for dissemination of results at venues such as the AGU Fall Meeting or the Association for Preservation Technology International annual conference. In Year 4, travel supports the HENTF webinar dissemination series and virtual transfer support to interested communities; remaining funds cover one conference presentation.</w:t>
-      </w:r>
-      <w:r>
-        <w:rPr>
-          <w:rFonts w:ascii="Times New Roman" w:hAnsi="Times New Roman" w:cs="Times New Roman"/>
-          <w:color w:val="FF0000"/>
-        </w:rPr>
-      </w:r>
-      <w:r>
-        <w:rPr>
-          <w:rFonts w:ascii="Times New Roman" w:hAnsi="Times New Roman" w:cs="Times New Roman"/>
-          <w:color w:val="FF0000"/>
-        </w:rPr>
-      </w:r>
-      <w:r>
-        <w:rPr>
-          <w:rFonts w:ascii="Times New Roman" w:hAnsi="Times New Roman" w:cs="Times New Roman"/>
-          <w:color w:val="FF0000"/>
-        </w:rPr>
-      </w:r>
-      <w:r>
-        <w:rPr>
-          <w:rFonts w:ascii="Times New Roman" w:hAnsi="Times New Roman" w:cs="Times New Roman"/>
-          <w:b/>
-          <w:u w:val="single"/>
-        </w:rPr>
-        <w:t xml:space="preserve"> </w:t>
+          <w:b/>
+        </w:rPr>
+        <w:t>Domestic Travel ($30,000)</w:t>
+      </w:r>
+      <w:r>
+        <w:rPr>
+          <w:b w:val="0"/>
+        </w:rPr>
+        <w:t xml:space="preserve"> – </w:t>
+      </w:r>
+      <w:r>
+        <w:rPr>
+          <w:b w:val="0"/>
+        </w:rPr>
+        <w:t>$7,500 per year for four years. Travel supports two annual trips: (1) Field Trip or Dissemination Trip (Years 1–4; $4,500/trip × 4 = $18,000). In Years 1–3, the PI and postdoctoral researcher travel to Montpelier, Vermont for community co-development workshops with emergency managers, historic preservation officials, and building owners. In Year 4, the PI and postdoctoral researcher attend a national conference together to present final project results and comparative findings. Each trip supports two travelers for 5 days/4 nights: airfare including baggage ($700/person × 2 = $1,400); lodging ($200/night × 4 nights × 2 rooms = $1,600); per diem for meals and incidental expenses ($75/day × 5 days × 2 persons = $750); and ground transportation including rental car, fuel, parking, and tolls ($750). (2) National Conference (Years 1–4; $3,000/trip × 4 = $12,000). One traveler (PI or postdoctoral researcher) attends one national conference per year for dissemination of results at venues such as the AGU Fall Meeting or the Association for Preservation Technology International annual conference. Each trip supports one traveler for 4 days/3 nights: registration ($600); airfare including baggage ($750); lodging ($250/night × 3 nights = $750); per diem for meals and incidental expenses ($75/day × 4 days = $300); ground transportation including rideshare and shuttle ($350); and poster printing and shipping ($250).</w:t>
       </w:r>
     </w:p>
     <w:p>

</xml_diff>